<commit_message>
Added the stuff Kadin said  i should
</commit_message>
<xml_diff>
--- a/Memento, Builder and CoF Abstractions.docx
+++ b/Memento, Builder and CoF Abstractions.docx
@@ -139,10 +139,14 @@
     </w:p>
     <w:p>
       <w:r>
-        <w:t>Also allows for us to process approvals and escalations without hardcoding the specifics of the roles involves.</w:t>
-      </w:r>
-    </w:p>
-    <w:p/>
+        <w:t>What Varies: The approval levels, who sits at each level and the time limits that each organisation has.</w:t>
+      </w:r>
+    </w:p>
+    <w:p>
+      <w:r>
+        <w:t>Why is it appropriate: It allows the system to process approvals and escalations without hardcoding the exact chain or the roles that may be involved. The chain can be configured at runtime.</w:t>
+      </w:r>
+    </w:p>
     <w:p>
       <w:pPr>
         <w:pStyle w:val="Heading2"/>
@@ -306,13 +310,30 @@
         <w:t xml:space="preserve"> to restore its previous state.</w:t>
       </w:r>
     </w:p>
-    <w:p/>
+    <w:p>
+      <w:r>
+        <w:t>What Varies: The state of the workflow instance over time and the point at which the system may need to return to.</w:t>
+      </w:r>
+    </w:p>
+    <w:p>
+      <w:r>
+        <w:lastRenderedPageBreak/>
+        <w:t xml:space="preserve">Why is it Appropriate: Keeps encapsulation of the </w:t>
+      </w:r>
+      <w:proofErr w:type="spellStart"/>
+      <w:r>
+        <w:t>WorkflowInstance</w:t>
+      </w:r>
+      <w:proofErr w:type="spellEnd"/>
+      <w:r>
+        <w:t xml:space="preserve"> by not exposing its internal variables while supporting history.</w:t>
+      </w:r>
+    </w:p>
     <w:p>
       <w:pPr>
         <w:pStyle w:val="Heading2"/>
       </w:pPr>
       <w:r>
-        <w:lastRenderedPageBreak/>
         <w:t>Builder – Workflow Construction</w:t>
       </w:r>
     </w:p>
@@ -444,6 +465,24 @@
       <w:proofErr w:type="spellEnd"/>
       <w:r>
         <w:t>.</w:t>
+      </w:r>
+    </w:p>
+    <w:p>
+      <w:r>
+        <w:t xml:space="preserve">What Varies: the specific arrangement of work items, stages an </w:t>
+      </w:r>
+      <w:proofErr w:type="gramStart"/>
+      <w:r>
+        <w:t>rules</w:t>
+      </w:r>
+      <w:proofErr w:type="gramEnd"/>
+      <w:r>
+        <w:t xml:space="preserve"> supplied by different organizations for different scenarios.</w:t>
+      </w:r>
+    </w:p>
+    <w:p>
+      <w:r>
+        <w:t>Why it is Appropriate: Prevents huge, unreadable constructors and separates the assembly logic from a scenario from the generic execution logic of the workflow engine.</w:t>
       </w:r>
     </w:p>
     <w:p/>

</xml_diff>